<commit_message>
Setup guide: note that Metadata permission auto-adds with Contents
Reassure the reader that "Metadata: Read-only" turning itself on when
they set Contents is normal and expected.

Co-Authored-By: Claude Opus 4.8 (1M context) <noreply@anthropic.com>
</commit_message>
<xml_diff>
--- a/Set-Up-Your-World-Cup-Sweep.docx
+++ b/Set-Up-Your-World-Cup-Sweep.docx
@@ -249,6 +249,15 @@
       </w:pPr>
       <w:r>
         <w:t>g) Open “Repository permissions”, find “Contents”, and set it to “Read and write”.</w:t>
+      </w:r>
+    </w:p>
+    <w:p>
+      <w:pPr>
+        <w:pStyle w:val="ListBullet"/>
+        <w:spacing w:after="60"/>
+      </w:pPr>
+      <w:r>
+        <w:t>When you do this, “Metadata” will switch itself on (Read-only). That is normal and required - just leave it as it is.</w:t>
       </w:r>
     </w:p>
     <w:p>

</xml_diff>